<commit_message>
cover letters: rewrite from real, pipeline-traceable claims
Beilstein cover letter claimed "35 Alzheimer's and Tau therapeutics"
(real 29) and "beta12 and chi3 allotropes" (the chi3-PEG-Tf system has no
real data and was dropped from the study). Rewritten: GFN2-xTB on 29 drugs
on pristine beta-12 borophene, Vina vs the Tau filament cryo-EM structure,
leak-free nested CV; the 3 cationic phenothiazine dyes with anomalous
positive interaction energies are stated honestly; chi3-PEG-Tf named as
future work only.

Added create_tau_cover_letter_md() so the Molecular Diversity cover letter
(previously an un-generated orphan) is regenerated with real claims.

Co-Authored-By: Claude Sonnet 5 <noreply@anthropic.com>
</commit_message>
<xml_diff>
--- a/manuscript/submission_ready/01_Cover_Letter_Molecular_Diversity.docx
+++ b/manuscript/submission_ready/01_Cover_Letter_Molecular_Diversity.docx
@@ -3,86 +3,107 @@
 <w:document xmlns:wpc="http://schemas.microsoft.com/office/word/2010/wordprocessingCanvas" xmlns:mo="http://schemas.microsoft.com/office/mac/office/2008/main" xmlns:mc="http://schemas.openxmlformats.org/markup-compatibility/2006" xmlns:mv="urn:schemas-microsoft-com:mac:vml" xmlns:o="urn:schemas-microsoft-com:office:office" xmlns:r="http://schemas.openxmlformats.org/officeDocument/2006/relationships" xmlns:m="http://schemas.openxmlformats.org/officeDocument/2006/math" xmlns:v="urn:schemas-microsoft-com:vml" xmlns:wp14="http://schemas.microsoft.com/office/word/2010/wordprocessingDrawing" xmlns:wp="http://schemas.openxmlformats.org/drawingml/2006/wordprocessingDrawing" xmlns:w10="urn:schemas-microsoft-com:office:word" xmlns:w="http://schemas.openxmlformats.org/wordprocessingml/2006/main" xmlns:w14="http://schemas.microsoft.com/office/word/2010/wordml" xmlns:wpg="http://schemas.microsoft.com/office/word/2010/wordprocessingGroup" xmlns:wpi="http://schemas.microsoft.com/office/word/2010/wordprocessingInk" xmlns:wne="http://schemas.microsoft.com/office/word/2006/wordml" xmlns:wps="http://schemas.microsoft.com/office/word/2010/wordprocessingShape" mc:Ignorable="w14 wp14">
   <w:body>
     <w:p>
-      <w:pPr>
-        <w:spacing w:after="160"/>
-      </w:pPr>
       <w:r>
         <w:rPr>
           <w:b/>
         </w:rPr>
-        <w:t>Date: August 31, 2026</w:t>
+        <w:t>Andrés Monreal Hernández, Ph.D.</w:t>
         <w:br/>
+        <w:t>Universidad Estatal de Sonora, Hermosillo, Sonora, Mexico</w:t>
         <w:br/>
-        <w:t>To:</w:t>
-        <w:br/>
-        <w:t>Prof. Dr. Salvatore Guccione</w:t>
-        <w:br/>
-        <w:t>Editor-in-Chief, Molecular Diversity</w:t>
-        <w:br/>
-        <w:t>Springer Nature</w:t>
+        <w:t>Email: andres.monreal@ues.mx | ORCID: 0009-0009-1207-8597</w:t>
       </w:r>
     </w:p>
     <w:p>
-      <w:pPr>
-        <w:spacing w:after="200"/>
-      </w:pPr>
+      <w:r>
+        <w:t>To: The Editor-in-Chief, Molecular Diversity (Springer Nature)</w:t>
+      </w:r>
+    </w:p>
+    <w:p>
+      <w:r>
+        <w:t>Dear Editor,</w:t>
+      </w:r>
+    </w:p>
+    <w:p>
+      <w:r>
+        <w:t>We submit our original research manuscript for consideration in Molecular Diversity:</w:t>
+      </w:r>
+    </w:p>
+    <w:p>
       <w:r>
         <w:rPr>
           <w:b/>
           <w:color w:val="4A148C"/>
         </w:rPr>
-        <w:t>Subject: Submission of Original Research Article titled 'Quantum-Chemical Profiling and Machine Learning-Driven Nano-QSAR of Functionalized 2D Borophene Nanosheets for Targeted Disaggregation of Pathological Tau Fibrils'</w:t>
+        <w:t>“Machine Learning-Driven Nano-QSAR and Quantum Chemical Design of Functionalized 2D Borophene Nanosheets for Targeted Disaggregation of Pathological Tau Fibrils in Alzheimer's Disease”</w:t>
+      </w:r>
+    </w:p>
+    <w:p>
+      <w:r>
+        <w:rPr>
+          <w:b/>
+        </w:rPr>
+        <w:t>Real, pipeline-traceable results:</w:t>
       </w:r>
     </w:p>
     <w:p>
       <w:pPr>
-        <w:spacing w:after="160" w:line="276" w:lineRule="auto"/>
+        <w:ind w:left="432"/>
       </w:pPr>
       <w:r>
-        <w:t>Dear Prof. Dr. Salvatore Guccione and Editorial Board Members,</w:t>
-        <w:br/>
-        <w:br/>
-        <w:t>We are pleased to submit our original research manuscript entitled 'Quantum-Chemical Profiling and Machine Learning-Driven Nano-QSAR of Functionalized 2D Borophene Nanosheets for Targeted Disaggregation of Pathological Tau Fibrils' for consideration for publication in Molecular Diversity.</w:t>
-        <w:br/>
-        <w:br/>
-        <w:t>The pathological self-assembly of microtubule-associated protein Tau into paired helical filaments (PHFs) and neurofibrillary tangles represents a defining histopathological hallmark of Alzheimer's disease. In this study, we present an integrated computational chemistry, nano-QSAR, and molecular docking investigation evaluating the supramolecular loading, quantum-chemical interaction space, and fibrillar disaggregation potential of two-dimensional metallic beta-12 borophene nanosheets. This work directly aligns with the core focus of Molecular Diversity in computational molecular design, structure-property relationships, and chemical library prioritization.</w:t>
-        <w:br/>
-        <w:br/>
-        <w:t>Key Highlights of our Investigation:</w:t>
-        <w:br/>
-        <w:t>1. Cryo-EM Fibrillar Docking: High-resolution docking on the 3.40 Å cryo-EM structure of human Alzheimer's disease Tau paired helical filament (PDB ID: 5O3L) mapped specific binding modes across the cross-beta protofilament cleft.</w:t>
-        <w:br/>
-        <w:t>2. Standardized Quantum Interaction Energetics: Evaluated tight-binding GFN2-xTB standardized intermolecular interactions (Delta_E_int,std = -22.4 to -36.2 kcal/mol) across 2D metallic beta-12 borophene and carboxylated functional forms.</w:t>
-        <w:br/>
-        <w:t>3. Multilevel DFT Benchmark: Validated GFN2-xTB against higher-level dispersion-corrected DFT single-point reference calculations (ORCA 6.1.1, B3LYP-D3BJ/def2-SVP) across representative anti-tau scaffolds, confirming strong rank preservation (MAE = 1.66 kcal/mol).</w:t>
-        <w:br/>
-        <w:t>4. OECD-Aligned Nano-QSAR Surrogate Modeling: Developed a leak-free nested cross-validated surrogate model with prespecified physicochemical &amp; CDFT descriptors (Q²_CV = +0.621, RMSE = 4.85 kcal/mol), verified against chance correlation by 1,000 Y-scrambling permutations (empirical p = 0.001).</w:t>
-        <w:br/>
-        <w:t>5. Complete Open Science &amp; Reproducibility: All codes, coordinates, and models are publicly accessible on GitHub (https://github.com/sircalch/borophene-alzheimer-tau-ai) and permanently archived under Zenodo DOI 10.5281/zenodo.22187835.</w:t>
-        <w:br/>
-        <w:br/>
-        <w:t>Suggested Independent Reviewers:</w:t>
-        <w:br/>
-        <w:t>1. Prof. Dr. Stefan Grimme (Universität Bonn, Germany) - Expert in semiempirical tight-binding methods (GFN-xTB) and dispersion corrections. Email: grimme@thch.uni-bonn.de</w:t>
-        <w:br/>
-        <w:t>2. Prof. Dr. Alexandre Varnek (University of Strasbourg, France) - Expert in chemoinformatics and QSAR/QSPR modeling. Email: varnek@unistra.fr</w:t>
-        <w:br/>
-        <w:t>3. Prof. Dr. Michel Goedert (MRC Laboratory of Molecular Biology, Cambridge, UK) - Pioneer in Tau filament structure and Alzheimer's disease pathology. Email: mg@mrc-lmb.cam.ac.uk</w:t>
-        <w:br/>
-        <w:t>4. Prof. Dr. Boris I. Yakobson (Rice University, USA) - Pioneer in 2D borophene synthesis, polymorph physics, and nanostructures. Email: biy@rice.edu</w:t>
-        <w:br/>
-        <w:br/>
-        <w:t>Thank you very much for your time and consideration of our manuscript.</w:t>
-        <w:br/>
-        <w:br/>
+        <w:t>GFN2-xTB single-point interaction energies for 29 Alzheimer's / Tau therapeutics on a pristine beta-12 borophene cluster; frontier-orbital and conceptual-DFT indices taken from the xtb output.</w:t>
+      </w:r>
+    </w:p>
+    <w:p>
+      <w:pPr>
+        <w:ind w:left="432"/>
+      </w:pPr>
+      <w:r>
+        <w:t>Physical AutoDock Vina v1.2.7 docking against the human Tau filament cryo-EM structure.</w:t>
+      </w:r>
+    </w:p>
+    <w:p>
+      <w:pPr>
+        <w:ind w:left="432"/>
+      </w:pPr>
+      <w:r>
+        <w:t>Leak-free nested 5x5 cross-validated surrogate model on the real interaction energies; the feature-importance analysis is presented as exploratory.</w:t>
+      </w:r>
+    </w:p>
+    <w:p>
+      <w:pPr>
+        <w:ind w:left="432"/>
+      </w:pPr>
+      <w:r>
+        <w:t>Three cationic phenothiazine dyes show anomalous positive interaction energies (steric clash) and are reported as such and flagged out-of-domain.</w:t>
+      </w:r>
+    </w:p>
+    <w:p>
+      <w:pPr>
+        <w:ind w:left="432"/>
+      </w:pPr>
+      <w:r>
+        <w:t>The chi3-PEG-Tf functionalized allotrope is proposed as future work; it has no real data in this study.</w:t>
+      </w:r>
+    </w:p>
+    <w:p>
+      <w:pPr>
+        <w:ind w:left="432"/>
+      </w:pPr>
+      <w:r>
+        <w:t>Full open-source pipeline and data archive (Zenodo 10.5281/zenodo.22187835).</w:t>
+      </w:r>
+    </w:p>
+    <w:p>
+      <w:r>
+        <w:t>The manuscript is original, not under consideration elsewhere, and all authors approve the submission and declare no competing interests.</w:t>
+      </w:r>
+    </w:p>
+    <w:p>
+      <w:r>
         <w:t>Sincerely,</w:t>
         <w:br/>
-        <w:br/>
         <w:t>Andrés Monreal Hernández, Ph.D. (Corresponding Author)</w:t>
-        <w:br/>
-        <w:t>Universidad Estatal de Sonora, Mexico</w:t>
-        <w:br/>
-        <w:t>Email: andres.monreal@ues.mx</w:t>
       </w:r>
     </w:p>
     <w:sectPr>

</xml_diff>

<commit_message>
Tau: cover letters reflect the reframed two-regime result
Beilstein + Molecular Diversity cover letters: borophene chemisorbs 12/29
ligands (not "single-point physisorption"), QSPR Q2_CV 0.30/0.06, no more
"chi3-PEG-Tf" / "anomalous phenothiazine dyes flagged out-of-domain".

Co-Authored-By: Claude Sonnet 5 <noreply@anthropic.com>
</commit_message>
<xml_diff>
--- a/manuscript/submission_ready/01_Cover_Letter_Molecular_Diversity.docx
+++ b/manuscript/submission_ready/01_Cover_Letter_Molecular_Diversity.docx
@@ -51,7 +51,7 @@
         <w:ind w:left="432"/>
       </w:pPr>
       <w:r>
-        <w:t>GFN2-xTB single-point interaction energies for 29 Alzheimer's / Tau therapeutics on a pristine beta-12 borophene cluster; frontier-orbital and conceptual-DFT indices taken from the xtb output.</w:t>
+        <w:t>GFN2-xTB adsorption of 29 Alzheimer's / Tau therapeutics on a pristine beta-12 borophene cluster, with every drug-surface complex relaxed (4 orientations); frontier-orbital and conceptual-DFT indices taken from the xtb output.</w:t>
       </w:r>
     </w:p>
     <w:p>
@@ -59,7 +59,7 @@
         <w:ind w:left="432"/>
       </w:pPr>
       <w:r>
-        <w:t>Physical AutoDock Vina v1.2.7 docking against the human Tau filament cryo-EM structure.</w:t>
+        <w:t>Central result: 12 of the 29 ligands chemisorb (covalent B-C/B-O, Delta_E_int,SP -81 to -233 kcal/mol); 17 physisorb (-8 to -44). Pristine borophene is a reactive surface, not a reversible carrier, for the pi-rich phenol/dye chemotype.</w:t>
       </w:r>
     </w:p>
     <w:p>
@@ -67,7 +67,7 @@
         <w:ind w:left="432"/>
       </w:pPr>
       <w:r>
-        <w:t>Leak-free nested 5x5 cross-validated surrogate model on the real interaction energies; the feature-importance analysis is presented as exploratory.</w:t>
+        <w:t>Physical AutoDock Vina v1.2.7 docking against the cryo-EM Tau filament core (PDB 5O3L).</w:t>
       </w:r>
     </w:p>
     <w:p>
@@ -75,7 +75,7 @@
         <w:ind w:left="432"/>
       </w:pPr>
       <w:r>
-        <w:t>Three cationic phenothiazine dyes show anomalous positive interaction energies (steric clash) and are reported as such and flagged out-of-domain.</w:t>
+        <w:t>Leak-free nested 5x5 cross-validated surrogate: Q2_CV = 0.30 (docking) and 0.06 (physisorption energy) - descriptor-based prediction is weak; the chemi/physisorption dichotomy is the model-free contribution.</w:t>
       </w:r>
     </w:p>
     <w:p>
@@ -83,7 +83,7 @@
         <w:ind w:left="432"/>
       </w:pPr>
       <w:r>
-        <w:t>The chi3-PEG-Tf functionalized allotrope is proposed as future work; it has no real data in this study.</w:t>
+        <w:t>A peptide-functionalized borophene is proposed as future work; it has no real data in this study.</w:t>
       </w:r>
     </w:p>
     <w:p>

</xml_diff>